<commit_message>
Add near-duplicate sensitivity analysis
</commit_message>
<xml_diff>
--- a/博士学位论文初稿.docx
+++ b/博士学位论文初稿.docx
@@ -106,7 +106,7 @@
         <w:rPr>
           <w:rFonts w:ascii="宋体" w:hAnsi="宋体" w:eastAsia="宋体"/>
         </w:rPr>
-        <w:t>逐病例统计显示，不同模块对困难病例的作用具有明显异质性。B 相对 U-Net 的平均 IoU 增益为 1.748 个百分点，95% Bootstrap 置信区间为 [0.615, 2.994] 个百分点；C 和 D 的病例级 Bootstrap 区间仍跨越零。随机种子 7、73 的完整复现实验均满足全部排序；三个种子的 UABCD 平均 IoU 为 75.128%±0.307%，平均 Dice 为 83.306%±0.223%。该证据比单次实验更强，但同一固定划分上的三个种子仍不足以支持强泛化结论。数据审计还发现 split 3 中存在 24 对高置信跨集合近重复图像，且近重复图像的标注一致性差异显著。本文据此提出扩展至五个种子、患者级去重、外部验证和临床一致性评价等后续研究方向。</w:t>
+        <w:t>逐病例统计显示，不同模块对困难病例的作用具有明显异质性。B 相对 U-Net 的平均 IoU 增益为 1.748 个百分点，95% Bootstrap 置信区间为 [0.615, 2.994] 个百分点；C 和 D 的病例级 Bootstrap 区间仍跨越零。随机种子 7、73 的完整复现实验均满足全部排序；三个种子的 UABCD 平均 IoU 为 75.128%±0.307%，平均 Dice 为 83.306%±0.223%。数据审计发现 split 3 中存在 24 对高置信跨集合近重复图像，涉及 20 个验证病例；剔除这些病例后，175 例 clean 子集上的三种子 UABCD 为 74.464% IoU 和 82.952% Dice，三种子均值仍保持全部排序，但部分单种子的 C 增益消失。该证据比单次实验更强，却仍不足以支持患者级或外部泛化结论。本文据此提出扩展至五个种子、患者级重划分、外部验证和临床一致性评价等后续研究方向。</w:t>
       </w:r>
     </w:p>
     <w:p>
@@ -170,7 +170,7 @@
         <w:rPr>
           <w:rFonts w:ascii="宋体" w:hAnsi="宋体" w:eastAsia="宋体"/>
         </w:rPr>
-        <w:t>In Chapter 1, U, UA, UB, and UAB achieve IoU scores of 72.445%, 73.622%, 74.193%, and 74.847%, and Dice scores of 80.718%, 81.817%, 82.537%, and 82.943%, respectively. UAB is therefore denoted as UnetAB. In Chapter 2, UABC and UABCD further improve IoU to 74.932% and 75.115%, and Dice to 83.022% and 83.480%. Complete replications with seeds 7 and 73 preserve every required ordering. Across seeds 7, 41, and 73, UABCD obtains 75.128% +/- 0.307% IoU and 83.306% +/- 0.223% Dice. The final model contains 11.31M active parameters and requires approximately 10.03 ms per 256×256 image on an RTX 4060 Laptop GPU. Per-case analyses reveal heterogeneous gains, and the confidence intervals of the incremental C and D effects still include zero. These findings support the architectural progression while also motivating five-seed replication, patient-level deduplication, external validation, and clinical reader studies.</w:t>
+        <w:t>In Chapter 1, U, UA, UB, and UAB achieve IoU scores of 72.445%, 73.622%, 74.193%, and 74.847%, and Dice scores of 80.718%, 81.817%, 82.537%, and 82.943%, respectively. UAB is therefore denoted as UnetAB. In Chapter 2, UABC and UABCD further improve IoU to 74.932% and 75.115%, and Dice to 83.022% and 83.480%. Complete replications with seeds 7 and 73 preserve every required ordering. Across seeds 7, 41, and 73, UABCD obtains 75.128% +/- 0.307% IoU and 83.306% +/- 0.223% Dice. After excluding 20 validation cases exposed to high-confidence cross-split visual near duplicates, the three-seed UABCD mean remains 74.464% IoU and 82.952% Dice, and the aggregate ordering is preserved, although the incremental effect of C disappears for some individual seeds. The final model contains 11.31M active parameters and requires approximately 10.03 ms per 256×256 image on an RTX 4060 Laptop GPU. These findings support the architectural progression while also motivating five-seed replication, patient-level re-splitting, external validation, and clinical reader studies.</w:t>
       </w:r>
     </w:p>
     <w:p>
@@ -1097,7 +1097,7 @@
         <w:rPr>
           <w:rFonts w:ascii="宋体" w:hAnsi="宋体" w:eastAsia="宋体"/>
         </w:rPr>
-        <w:t>审计结果表明，训练集与验证集不存在同名重叠，也不存在字节级完全相同图像，但存在 24 对高置信跨集合近重复图像。近重复图像对应掩码的平均 IoU 为 83.261%，范围为 11.752%—93.912%。这意味着 BUSI 同时存在患者级近重复风险和标注不一致。本文保留固定 split 3 以保证实验连续性，但不将其视为患者级严格独立划分，并在结论中限制外推范围。</w:t>
+        <w:t>审计结果表明，训练集与验证集不存在同名重叠，也不存在字节级完全相同图像，但存在 24 对高置信跨集合近重复图像，共涉及 20 个不同验证病例。近重复图像对应掩码的平均 IoU 为 83.261%，范围为 11.752%—93.912%。这意味着 BUSI 同时存在患者级近重复风险和标注不一致。本文保留固定 split 3 以保证实验连续性，同时增加剔除上述 20 个验证病例的三种子敏感性分析；但该分析仍不能把 split 3 视为经患者身份核验的严格独立划分。</w:t>
       </w:r>
     </w:p>
     <w:p>
@@ -4170,6 +4170,596 @@
     </w:p>
     <w:p>
       <w:pPr>
+        <w:pStyle w:val="Heading3"/>
+        <w:ind w:firstLine="0"/>
+      </w:pPr>
+      <w:r>
+        <w:t>5.3.1 去近重复验证敏感性分析</w:t>
+      </w:r>
+    </w:p>
+    <w:p>
+      <w:pPr>
+        <w:ind w:firstLine="420"/>
+      </w:pPr>
+      <w:r>
+        <w:rPr>
+          <w:rFonts w:ascii="宋体" w:hAnsi="宋体" w:eastAsia="宋体"/>
+        </w:rPr>
+        <w:t>为评估排序是否由跨集合视觉近重复病例驱动，本文依据感知哈希距离不超过 4 且 64×64 归一化缩略图相关系数不低于 0.98 的预设规则，识别 24 对高置信跨集合近重复图像，并从验证统计中剔除涉及的 20 个不同病例。该操作不改变训练集、不重新训练模型、不调整阈值，只在原 195 例验证集之外形成 175 例 clean 敏感性子集。</w:t>
+      </w:r>
+    </w:p>
+    <w:tbl>
+      <w:tblPr>
+        <w:tblStyle w:val="TableGrid"/>
+        <w:tblW w:type="auto" w:w="0"/>
+        <w:jc w:val="center"/>
+        <w:tblLook w:firstColumn="1" w:firstRow="1" w:lastColumn="0" w:lastRow="0" w:noHBand="0" w:noVBand="1" w:val="04A0"/>
+      </w:tblPr>
+      <w:tblGrid>
+        <w:gridCol w:w="2280"/>
+        <w:gridCol w:w="2280"/>
+        <w:gridCol w:w="2280"/>
+        <w:gridCol w:w="2280"/>
+      </w:tblGrid>
+      <w:tr>
+        <w:trPr>
+          <w:tblHeader w:val="true"/>
+        </w:trPr>
+        <w:tc>
+          <w:tcPr>
+            <w:tcW w:type="dxa" w:w="2280"/>
+            <w:vAlign w:val="center"/>
+          </w:tcPr>
+          <w:p>
+            <w:r/>
+            <w:r>
+              <w:rPr>
+                <w:rFonts w:ascii="宋体" w:hAnsi="宋体" w:eastAsia="宋体"/>
+                <w:b/>
+                <w:sz w:val="18"/>
+              </w:rPr>
+              <w:t>模型</w:t>
+            </w:r>
+          </w:p>
+        </w:tc>
+        <w:tc>
+          <w:tcPr>
+            <w:tcW w:type="dxa" w:w="2280"/>
+            <w:vAlign w:val="center"/>
+          </w:tcPr>
+          <w:p>
+            <w:r/>
+            <w:r>
+              <w:rPr>
+                <w:rFonts w:ascii="宋体" w:hAnsi="宋体" w:eastAsia="宋体"/>
+                <w:b/>
+                <w:sz w:val="18"/>
+              </w:rPr>
+              <w:t>完整集 IoU/Dice（%）</w:t>
+            </w:r>
+          </w:p>
+        </w:tc>
+        <w:tc>
+          <w:tcPr>
+            <w:tcW w:type="dxa" w:w="2280"/>
+            <w:vAlign w:val="center"/>
+          </w:tcPr>
+          <w:p>
+            <w:r/>
+            <w:r>
+              <w:rPr>
+                <w:rFonts w:ascii="宋体" w:hAnsi="宋体" w:eastAsia="宋体"/>
+                <w:b/>
+                <w:sz w:val="18"/>
+              </w:rPr>
+              <w:t>clean 子集 IoU/Dice（%）</w:t>
+            </w:r>
+          </w:p>
+        </w:tc>
+        <w:tc>
+          <w:tcPr>
+            <w:tcW w:type="dxa" w:w="2280"/>
+            <w:vAlign w:val="center"/>
+          </w:tcPr>
+          <w:p>
+            <w:r/>
+            <w:r>
+              <w:rPr>
+                <w:rFonts w:ascii="宋体" w:hAnsi="宋体" w:eastAsia="宋体"/>
+                <w:b/>
+                <w:sz w:val="18"/>
+              </w:rPr>
+              <w:t>近重复暴露子集 IoU/Dice（%）</w:t>
+            </w:r>
+          </w:p>
+        </w:tc>
+      </w:tr>
+      <w:tr>
+        <w:tc>
+          <w:tcPr>
+            <w:tcW w:type="dxa" w:w="2280"/>
+            <w:vAlign w:val="center"/>
+          </w:tcPr>
+          <w:p>
+            <w:r/>
+            <w:r>
+              <w:rPr>
+                <w:rFonts w:ascii="宋体" w:hAnsi="宋体" w:eastAsia="宋体"/>
+                <w:b w:val="0"/>
+                <w:sz w:val="18"/>
+              </w:rPr>
+              <w:t>U</w:t>
+            </w:r>
+          </w:p>
+        </w:tc>
+        <w:tc>
+          <w:tcPr>
+            <w:tcW w:type="dxa" w:w="2280"/>
+            <w:vAlign w:val="center"/>
+          </w:tcPr>
+          <w:p>
+            <w:r/>
+            <w:r>
+              <w:rPr>
+                <w:rFonts w:ascii="宋体" w:hAnsi="宋体" w:eastAsia="宋体"/>
+                <w:b w:val="0"/>
+                <w:sz w:val="18"/>
+              </w:rPr>
+              <w:t>72.445 / 80.718</w:t>
+            </w:r>
+          </w:p>
+        </w:tc>
+        <w:tc>
+          <w:tcPr>
+            <w:tcW w:type="dxa" w:w="2280"/>
+            <w:vAlign w:val="center"/>
+          </w:tcPr>
+          <w:p>
+            <w:r/>
+            <w:r>
+              <w:rPr>
+                <w:rFonts w:ascii="宋体" w:hAnsi="宋体" w:eastAsia="宋体"/>
+                <w:b w:val="0"/>
+                <w:sz w:val="18"/>
+              </w:rPr>
+              <w:t>71.634 / 80.250</w:t>
+            </w:r>
+          </w:p>
+        </w:tc>
+        <w:tc>
+          <w:tcPr>
+            <w:tcW w:type="dxa" w:w="2280"/>
+            <w:vAlign w:val="center"/>
+          </w:tcPr>
+          <w:p>
+            <w:r/>
+            <w:r>
+              <w:rPr>
+                <w:rFonts w:ascii="宋体" w:hAnsi="宋体" w:eastAsia="宋体"/>
+                <w:b w:val="0"/>
+                <w:sz w:val="18"/>
+              </w:rPr>
+              <w:t>79.542 / 84.814</w:t>
+            </w:r>
+          </w:p>
+        </w:tc>
+      </w:tr>
+      <w:tr>
+        <w:tc>
+          <w:tcPr>
+            <w:tcW w:type="dxa" w:w="2280"/>
+            <w:vAlign w:val="center"/>
+          </w:tcPr>
+          <w:p>
+            <w:r/>
+            <w:r>
+              <w:rPr>
+                <w:rFonts w:ascii="宋体" w:hAnsi="宋体" w:eastAsia="宋体"/>
+                <w:b w:val="0"/>
+                <w:sz w:val="18"/>
+              </w:rPr>
+              <w:t>UA</w:t>
+            </w:r>
+          </w:p>
+        </w:tc>
+        <w:tc>
+          <w:tcPr>
+            <w:tcW w:type="dxa" w:w="2280"/>
+            <w:vAlign w:val="center"/>
+          </w:tcPr>
+          <w:p>
+            <w:r/>
+            <w:r>
+              <w:rPr>
+                <w:rFonts w:ascii="宋体" w:hAnsi="宋体" w:eastAsia="宋体"/>
+                <w:b w:val="0"/>
+                <w:sz w:val="18"/>
+              </w:rPr>
+              <w:t>73.835 / 81.947</w:t>
+            </w:r>
+          </w:p>
+        </w:tc>
+        <w:tc>
+          <w:tcPr>
+            <w:tcW w:type="dxa" w:w="2280"/>
+            <w:vAlign w:val="center"/>
+          </w:tcPr>
+          <w:p>
+            <w:r/>
+            <w:r>
+              <w:rPr>
+                <w:rFonts w:ascii="宋体" w:hAnsi="宋体" w:eastAsia="宋体"/>
+                <w:b w:val="0"/>
+                <w:sz w:val="18"/>
+              </w:rPr>
+              <w:t>73.169 / 81.600</w:t>
+            </w:r>
+          </w:p>
+        </w:tc>
+        <w:tc>
+          <w:tcPr>
+            <w:tcW w:type="dxa" w:w="2280"/>
+            <w:vAlign w:val="center"/>
+          </w:tcPr>
+          <w:p>
+            <w:r/>
+            <w:r>
+              <w:rPr>
+                <w:rFonts w:ascii="宋体" w:hAnsi="宋体" w:eastAsia="宋体"/>
+                <w:b w:val="0"/>
+                <w:sz w:val="18"/>
+              </w:rPr>
+              <w:t>79.655 / 84.976</w:t>
+            </w:r>
+          </w:p>
+        </w:tc>
+      </w:tr>
+      <w:tr>
+        <w:tc>
+          <w:tcPr>
+            <w:tcW w:type="dxa" w:w="2280"/>
+            <w:vAlign w:val="center"/>
+          </w:tcPr>
+          <w:p>
+            <w:r/>
+            <w:r>
+              <w:rPr>
+                <w:rFonts w:ascii="宋体" w:hAnsi="宋体" w:eastAsia="宋体"/>
+                <w:b w:val="0"/>
+                <w:sz w:val="18"/>
+              </w:rPr>
+              <w:t>UB</w:t>
+            </w:r>
+          </w:p>
+        </w:tc>
+        <w:tc>
+          <w:tcPr>
+            <w:tcW w:type="dxa" w:w="2280"/>
+            <w:vAlign w:val="center"/>
+          </w:tcPr>
+          <w:p>
+            <w:r/>
+            <w:r>
+              <w:rPr>
+                <w:rFonts w:ascii="宋体" w:hAnsi="宋体" w:eastAsia="宋体"/>
+                <w:b w:val="0"/>
+                <w:sz w:val="18"/>
+              </w:rPr>
+              <w:t>74.009 / 82.356</w:t>
+            </w:r>
+          </w:p>
+        </w:tc>
+        <w:tc>
+          <w:tcPr>
+            <w:tcW w:type="dxa" w:w="2280"/>
+            <w:vAlign w:val="center"/>
+          </w:tcPr>
+          <w:p>
+            <w:r/>
+            <w:r>
+              <w:rPr>
+                <w:rFonts w:ascii="宋体" w:hAnsi="宋体" w:eastAsia="宋体"/>
+                <w:b w:val="0"/>
+                <w:sz w:val="18"/>
+              </w:rPr>
+              <w:t>73.366 / 82.059</w:t>
+            </w:r>
+          </w:p>
+        </w:tc>
+        <w:tc>
+          <w:tcPr>
+            <w:tcW w:type="dxa" w:w="2280"/>
+            <w:vAlign w:val="center"/>
+          </w:tcPr>
+          <w:p>
+            <w:r/>
+            <w:r>
+              <w:rPr>
+                <w:rFonts w:ascii="宋体" w:hAnsi="宋体" w:eastAsia="宋体"/>
+                <w:b w:val="0"/>
+                <w:sz w:val="18"/>
+              </w:rPr>
+              <w:t>79.641 / 84.955</w:t>
+            </w:r>
+          </w:p>
+        </w:tc>
+      </w:tr>
+      <w:tr>
+        <w:tc>
+          <w:tcPr>
+            <w:tcW w:type="dxa" w:w="2280"/>
+            <w:vAlign w:val="center"/>
+          </w:tcPr>
+          <w:p>
+            <w:r/>
+            <w:r>
+              <w:rPr>
+                <w:rFonts w:ascii="宋体" w:hAnsi="宋体" w:eastAsia="宋体"/>
+                <w:b w:val="0"/>
+                <w:sz w:val="18"/>
+              </w:rPr>
+              <w:t>UAB</w:t>
+            </w:r>
+          </w:p>
+        </w:tc>
+        <w:tc>
+          <w:tcPr>
+            <w:tcW w:type="dxa" w:w="2280"/>
+            <w:vAlign w:val="center"/>
+          </w:tcPr>
+          <w:p>
+            <w:r/>
+            <w:r>
+              <w:rPr>
+                <w:rFonts w:ascii="宋体" w:hAnsi="宋体" w:eastAsia="宋体"/>
+                <w:b w:val="0"/>
+                <w:sz w:val="18"/>
+              </w:rPr>
+              <w:t>74.617 / 82.826</w:t>
+            </w:r>
+          </w:p>
+        </w:tc>
+        <w:tc>
+          <w:tcPr>
+            <w:tcW w:type="dxa" w:w="2280"/>
+            <w:vAlign w:val="center"/>
+          </w:tcPr>
+          <w:p>
+            <w:r/>
+            <w:r>
+              <w:rPr>
+                <w:rFonts w:ascii="宋体" w:hAnsi="宋体" w:eastAsia="宋体"/>
+                <w:b w:val="0"/>
+                <w:sz w:val="18"/>
+              </w:rPr>
+              <w:t>74.009 / 82.553</w:t>
+            </w:r>
+          </w:p>
+        </w:tc>
+        <w:tc>
+          <w:tcPr>
+            <w:tcW w:type="dxa" w:w="2280"/>
+            <w:vAlign w:val="center"/>
+          </w:tcPr>
+          <w:p>
+            <w:r/>
+            <w:r>
+              <w:rPr>
+                <w:rFonts w:ascii="宋体" w:hAnsi="宋体" w:eastAsia="宋体"/>
+                <w:b w:val="0"/>
+                <w:sz w:val="18"/>
+              </w:rPr>
+              <w:t>79.931 / 85.220</w:t>
+            </w:r>
+          </w:p>
+        </w:tc>
+      </w:tr>
+      <w:tr>
+        <w:tc>
+          <w:tcPr>
+            <w:tcW w:type="dxa" w:w="2280"/>
+            <w:vAlign w:val="center"/>
+          </w:tcPr>
+          <w:p>
+            <w:r/>
+            <w:r>
+              <w:rPr>
+                <w:rFonts w:ascii="宋体" w:hAnsi="宋体" w:eastAsia="宋体"/>
+                <w:b w:val="0"/>
+                <w:sz w:val="18"/>
+              </w:rPr>
+              <w:t>UABC</w:t>
+            </w:r>
+          </w:p>
+        </w:tc>
+        <w:tc>
+          <w:tcPr>
+            <w:tcW w:type="dxa" w:w="2280"/>
+            <w:vAlign w:val="center"/>
+          </w:tcPr>
+          <w:p>
+            <w:r/>
+            <w:r>
+              <w:rPr>
+                <w:rFonts w:ascii="宋体" w:hAnsi="宋体" w:eastAsia="宋体"/>
+                <w:b w:val="0"/>
+                <w:sz w:val="18"/>
+              </w:rPr>
+              <w:t>74.797 / 82.958</w:t>
+            </w:r>
+          </w:p>
+        </w:tc>
+        <w:tc>
+          <w:tcPr>
+            <w:tcW w:type="dxa" w:w="2280"/>
+            <w:vAlign w:val="center"/>
+          </w:tcPr>
+          <w:p>
+            <w:r/>
+            <w:r>
+              <w:rPr>
+                <w:rFonts w:ascii="宋体" w:hAnsi="宋体" w:eastAsia="宋体"/>
+                <w:b w:val="0"/>
+                <w:sz w:val="18"/>
+              </w:rPr>
+              <w:t>74.122 / 82.588</w:t>
+            </w:r>
+          </w:p>
+        </w:tc>
+        <w:tc>
+          <w:tcPr>
+            <w:tcW w:type="dxa" w:w="2280"/>
+            <w:vAlign w:val="center"/>
+          </w:tcPr>
+          <w:p>
+            <w:r/>
+            <w:r>
+              <w:rPr>
+                <w:rFonts w:ascii="宋体" w:hAnsi="宋体" w:eastAsia="宋体"/>
+                <w:b w:val="0"/>
+                <w:sz w:val="18"/>
+              </w:rPr>
+              <w:t>80.696 / 86.193</w:t>
+            </w:r>
+          </w:p>
+        </w:tc>
+      </w:tr>
+      <w:tr>
+        <w:tc>
+          <w:tcPr>
+            <w:tcW w:type="dxa" w:w="2280"/>
+            <w:vAlign w:val="center"/>
+          </w:tcPr>
+          <w:p>
+            <w:r/>
+            <w:r>
+              <w:rPr>
+                <w:rFonts w:ascii="宋体" w:hAnsi="宋体" w:eastAsia="宋体"/>
+                <w:b w:val="0"/>
+                <w:sz w:val="18"/>
+              </w:rPr>
+              <w:t>UABCD</w:t>
+            </w:r>
+          </w:p>
+        </w:tc>
+        <w:tc>
+          <w:tcPr>
+            <w:tcW w:type="dxa" w:w="2280"/>
+            <w:vAlign w:val="center"/>
+          </w:tcPr>
+          <w:p>
+            <w:r/>
+            <w:r>
+              <w:rPr>
+                <w:rFonts w:ascii="宋体" w:hAnsi="宋体" w:eastAsia="宋体"/>
+                <w:b w:val="0"/>
+                <w:sz w:val="18"/>
+              </w:rPr>
+              <w:t>75.128 / 83.306</w:t>
+            </w:r>
+          </w:p>
+        </w:tc>
+        <w:tc>
+          <w:tcPr>
+            <w:tcW w:type="dxa" w:w="2280"/>
+            <w:vAlign w:val="center"/>
+          </w:tcPr>
+          <w:p>
+            <w:r/>
+            <w:r>
+              <w:rPr>
+                <w:rFonts w:ascii="宋体" w:hAnsi="宋体" w:eastAsia="宋体"/>
+                <w:b w:val="0"/>
+                <w:sz w:val="18"/>
+              </w:rPr>
+              <w:t>74.464 / 82.952</w:t>
+            </w:r>
+          </w:p>
+        </w:tc>
+        <w:tc>
+          <w:tcPr>
+            <w:tcW w:type="dxa" w:w="2280"/>
+            <w:vAlign w:val="center"/>
+          </w:tcPr>
+          <w:p>
+            <w:r/>
+            <w:r>
+              <w:rPr>
+                <w:rFonts w:ascii="宋体" w:hAnsi="宋体" w:eastAsia="宋体"/>
+                <w:b w:val="0"/>
+                <w:sz w:val="18"/>
+              </w:rPr>
+              <w:t>80.935 / 86.399</w:t>
+            </w:r>
+          </w:p>
+        </w:tc>
+      </w:tr>
+    </w:tbl>
+    <w:p/>
+    <w:p>
+      <w:pPr>
+        <w:jc w:val="center"/>
+      </w:pPr>
+      <w:r>
+        <w:drawing>
+          <wp:inline xmlns:a="http://schemas.openxmlformats.org/drawingml/2006/main" xmlns:pic="http://schemas.openxmlformats.org/drawingml/2006/picture">
+            <wp:extent cx="5400000" cy="2164557"/>
+            <wp:docPr id="10" name="Picture 10"/>
+            <wp:cNvGraphicFramePr>
+              <a:graphicFrameLocks noChangeAspect="1"/>
+            </wp:cNvGraphicFramePr>
+            <a:graphic>
+              <a:graphicData uri="http://schemas.openxmlformats.org/drawingml/2006/picture">
+                <pic:pic>
+                  <pic:nvPicPr>
+                    <pic:cNvPr id="0" name="fig10_deduplicated_sensitivity.png"/>
+                    <pic:cNvPicPr/>
+                  </pic:nvPicPr>
+                  <pic:blipFill>
+                    <a:blip r:embed="rId19"/>
+                    <a:stretch>
+                      <a:fillRect/>
+                    </a:stretch>
+                  </pic:blipFill>
+                  <pic:spPr>
+                    <a:xfrm>
+                      <a:off x="0" y="0"/>
+                      <a:ext cx="5400000" cy="2164557"/>
+                    </a:xfrm>
+                    <a:prstGeom prst="rect"/>
+                  </pic:spPr>
+                </pic:pic>
+              </a:graphicData>
+            </a:graphic>
+          </wp:inline>
+        </w:drawing>
+      </w:r>
+    </w:p>
+    <w:p>
+      <w:pPr>
+        <w:jc w:val="center"/>
+      </w:pPr>
+      <w:r>
+        <w:rPr>
+          <w:rFonts w:ascii="宋体" w:hAnsi="宋体" w:eastAsia="宋体"/>
+          <w:sz w:val="18"/>
+        </w:rPr>
+        <w:t>去近重复验证敏感性分析</w:t>
+      </w:r>
+    </w:p>
+    <w:p>
+      <w:pPr>
+        <w:ind w:firstLine="420"/>
+      </w:pPr>
+      <w:r>
+        <w:rPr>
+          <w:rFonts w:ascii="宋体" w:hAnsi="宋体" w:eastAsia="宋体"/>
+        </w:rPr>
+        <w:t>三种子均值在完整集、clean 子集和近重复暴露子集上均满足第一章 UAB 最优以及第二章 UAB&lt;UABC&lt;UABCD 的 IoU、Dice 严格排序，说明总体递进关系并非仅由近重复病例产生。然而，近重复暴露子集明显更容易：U-Net 的 IoU 比 clean 子集高 7.908 个百分点，UABCD 高 6.471 个百分点；完整验证集的绝对值因此可能受到一定乐观偏移。更重要的是，逐种子检查显示 seed 7 的 UABC 在 clean 子集上相对 UAB 的 IoU、Dice 均轻微下降，seed 41 的 UABC Dice 也轻微下降，只有 seed 73 完整保序。这一反例进一步确认 C 是最不稳定的增量模块。故本文只将该结果解释为“三种子平均排序对近重复剔除具有稳健性”，不将其替代患者级重新划分和重新训练。</w:t>
+      </w:r>
+    </w:p>
+    <w:p>
+      <w:pPr>
         <w:pStyle w:val="Heading2"/>
         <w:ind w:firstLine="0"/>
       </w:pPr>
@@ -4232,7 +4822,7 @@
         <w:rPr>
           <w:rFonts w:ascii="宋体" w:hAnsi="宋体" w:eastAsia="宋体"/>
         </w:rPr>
-        <w:t>这种分层表述避免将单次最优结果扩大为临床普适结论。对于博士论文终稿，应至少增加 3—5 个随机种子，报告均值、标准差与配对效应；对每个模型使用相同总更新步数；在去重患者划分和外部数据集上重复验证。</w:t>
+        <w:t>这种分层表述避免将单次最优结果扩大为临床普适结论。本文已完成三个随机种子并报告均值与标准差；博士论文终稿仍应扩展至五个种子，对每个模型使用相同总更新步数，并在基于患者身份重建的划分和外部数据集上重复验证。</w:t>
       </w:r>
     </w:p>
     <w:p>
@@ -4387,7 +4977,7 @@
         <w:rPr>
           <w:rFonts w:ascii="宋体" w:hAnsi="宋体" w:eastAsia="宋体"/>
         </w:rPr>
-        <w:t>数据划分不是经过患者标识核验的患者级独立划分，存在跨集合近重复。</w:t>
+        <w:t>数据划分不是经过患者标识核验的患者级独立划分；去除 20 个近重复暴露验证病例后，三种子均值保持排序，但个别种子的 C 增益消失。</w:t>
       </w:r>
     </w:p>
     <w:p>
@@ -5319,6 +5909,59 @@
                 <w:sz w:val="18"/>
               </w:rPr>
               <w:t>患者级去重划分</w:t>
+            </w:r>
+          </w:p>
+        </w:tc>
+      </w:tr>
+      <w:tr>
+        <w:tc>
+          <w:tcPr>
+            <w:tcW w:type="dxa" w:w="3041"/>
+            <w:vAlign w:val="center"/>
+          </w:tcPr>
+          <w:p>
+            <w:r/>
+            <w:r>
+              <w:rPr>
+                <w:rFonts w:ascii="宋体" w:hAnsi="宋体" w:eastAsia="宋体"/>
+                <w:b w:val="0"/>
+                <w:sz w:val="18"/>
+              </w:rPr>
+              <w:t>去近重复敏感性分析</w:t>
+            </w:r>
+          </w:p>
+        </w:tc>
+        <w:tc>
+          <w:tcPr>
+            <w:tcW w:type="dxa" w:w="3041"/>
+            <w:vAlign w:val="center"/>
+          </w:tcPr>
+          <w:p>
+            <w:r/>
+            <w:r>
+              <w:rPr>
+                <w:rFonts w:ascii="宋体" w:hAnsi="宋体" w:eastAsia="宋体"/>
+                <w:b w:val="0"/>
+                <w:sz w:val="18"/>
+              </w:rPr>
+              <w:t>已完成三种子、175 例 clean 子集</w:t>
+            </w:r>
+          </w:p>
+        </w:tc>
+        <w:tc>
+          <w:tcPr>
+            <w:tcW w:type="dxa" w:w="3041"/>
+            <w:vAlign w:val="center"/>
+          </w:tcPr>
+          <w:p>
+            <w:r/>
+            <w:r>
+              <w:rPr>
+                <w:rFonts w:ascii="宋体" w:hAnsi="宋体" w:eastAsia="宋体"/>
+                <w:b w:val="0"/>
+                <w:sz w:val="18"/>
+              </w:rPr>
+              <w:t>基于患者身份重新划分并训练</w:t>
             </w:r>
           </w:p>
         </w:tc>

</xml_diff>